<commit_message>
Modify document - Enviroment version 1.1
</commit_message>
<xml_diff>
--- a/Doc/Enviroment from D2R game.docx
+++ b/Doc/Enviroment from D2R game.docx
@@ -62,6 +62,9 @@
         <w:jc w:val="center"/>
       </w:pPr>
       <w:r>
+        <w:rPr>
+          <w:noProof/>
+        </w:rPr>
         <w:drawing>
           <wp:inline distT="0" distB="0" distL="0" distR="0" wp14:anchorId="06AB5151" wp14:editId="755B4672">
             <wp:extent cx="1305107" cy="2381582"/>
@@ -373,6 +376,9 @@
         </mc:AlternateContent>
       </w:r>
       <w:r>
+        <w:rPr>
+          <w:noProof/>
+        </w:rPr>
         <w:drawing>
           <wp:inline distT="0" distB="0" distL="0" distR="0" wp14:anchorId="5F5233BE" wp14:editId="6F97EF4A">
             <wp:extent cx="1305107" cy="2381582"/>
@@ -528,6 +534,9 @@
         </mc:AlternateContent>
       </w:r>
       <w:r>
+        <w:rPr>
+          <w:noProof/>
+        </w:rPr>
         <w:drawing>
           <wp:inline distT="0" distB="0" distL="0" distR="0" wp14:anchorId="1AEAFDCC" wp14:editId="44172AB0">
             <wp:extent cx="1343212" cy="1000265"/>
@@ -682,6 +691,9 @@
         </mc:AlternateContent>
       </w:r>
       <w:r>
+        <w:rPr>
+          <w:noProof/>
+        </w:rPr>
         <w:drawing>
           <wp:inline distT="0" distB="0" distL="0" distR="0" wp14:anchorId="25DD6ED9" wp14:editId="5021B02A">
             <wp:extent cx="1352550" cy="1470355"/>
@@ -837,6 +849,9 @@
         </mc:AlternateContent>
       </w:r>
       <w:r>
+        <w:rPr>
+          <w:noProof/>
+        </w:rPr>
         <w:drawing>
           <wp:inline distT="0" distB="0" distL="0" distR="0" wp14:anchorId="21B57196" wp14:editId="48D35664">
             <wp:extent cx="1524213" cy="2905530"/>
@@ -981,6 +996,9 @@
         </mc:AlternateContent>
       </w:r>
       <w:r>
+        <w:rPr>
+          <w:noProof/>
+        </w:rPr>
         <w:drawing>
           <wp:inline distT="0" distB="0" distL="0" distR="0" wp14:anchorId="0DE9C751" wp14:editId="5C9023B3">
             <wp:extent cx="1714739" cy="3238952"/>
@@ -1124,6 +1142,9 @@
         </mc:AlternateContent>
       </w:r>
       <w:r>
+        <w:rPr>
+          <w:noProof/>
+        </w:rPr>
         <w:drawing>
           <wp:inline distT="0" distB="0" distL="0" distR="0" wp14:anchorId="4948A680" wp14:editId="03284A34">
             <wp:extent cx="1543265" cy="3419952"/>
@@ -1181,6 +1202,66 @@
         <w:t>. Struktura podkatalogu texture</w:t>
       </w:r>
     </w:p>
+    <w:p>
+      <w:r>
+        <w:t>Noesis ma problem z w</w:t>
+      </w:r>
+      <w:r>
+        <w:t>yświetlenie modeli otoczenia np. beczki, krzaki, drzewa, ruiny. Wtedy trzeba zmienić ANIMATION_MODE na 0. Ponieważ szuka plików animacji, które te obiekty nie posiadają. Natomiast nie wczytuje on tekstur dla tych obiektów, mimo że większa część z nich znajduje się w folderze z plikami w formacie *.textures.</w:t>
+      </w:r>
+    </w:p>
+    <w:p>
+      <w:pPr>
+        <w:shd w:val="clear" w:color="auto" w:fill="1E1E1E"/>
+        <w:spacing w:after="0" w:line="285" w:lineRule="atLeast"/>
+        <w:rPr>
+          <w:rFonts w:ascii="Consolas" w:eastAsia="Times New Roman" w:hAnsi="Consolas" w:cs="Times New Roman"/>
+          <w:color w:val="D4D4D4"/>
+          <w:kern w:val="0"/>
+          <w:sz w:val="21"/>
+          <w:szCs w:val="21"/>
+          <w:lang w:eastAsia="pl-PL"/>
+          <w14:ligatures w14:val="none"/>
+        </w:rPr>
+      </w:pPr>
+      <w:r>
+        <w:rPr>
+          <w:rFonts w:ascii="Consolas" w:eastAsia="Times New Roman" w:hAnsi="Consolas" w:cs="Times New Roman"/>
+          <w:color w:val="4FC1FF"/>
+          <w:kern w:val="0"/>
+          <w:sz w:val="21"/>
+          <w:szCs w:val="21"/>
+          <w:lang w:eastAsia="pl-PL"/>
+          <w14:ligatures w14:val="none"/>
+        </w:rPr>
+        <w:t>ANIMATION_MODE</w:t>
+      </w:r>
+      <w:r>
+        <w:rPr>
+          <w:rFonts w:ascii="Consolas" w:eastAsia="Times New Roman" w:hAnsi="Consolas" w:cs="Times New Roman"/>
+          <w:color w:val="D4D4D4"/>
+          <w:kern w:val="0"/>
+          <w:sz w:val="21"/>
+          <w:szCs w:val="21"/>
+          <w:lang w:eastAsia="pl-PL"/>
+          <w14:ligatures w14:val="none"/>
+        </w:rPr>
+        <w:t xml:space="preserve"> = </w:t>
+      </w:r>
+      <w:r>
+        <w:rPr>
+          <w:rFonts w:ascii="Consolas" w:eastAsia="Times New Roman" w:hAnsi="Consolas" w:cs="Times New Roman"/>
+          <w:color w:val="B5CEA8"/>
+          <w:kern w:val="0"/>
+          <w:sz w:val="21"/>
+          <w:szCs w:val="21"/>
+          <w:lang w:eastAsia="pl-PL"/>
+          <w14:ligatures w14:val="none"/>
+        </w:rPr>
+        <w:t>0</w:t>
+      </w:r>
+    </w:p>
+    <w:p/>
     <w:p/>
     <w:sectPr>
       <w:footerReference w:type="default" r:id="rId12"/>
@@ -1226,7 +1307,10 @@
       <w:jc w:val="right"/>
     </w:pPr>
     <w:r>
-      <w:t>Enviroment version 1.0</w:t>
+      <w:t>Enviroment version 1.</w:t>
+    </w:r>
+    <w:r>
+      <w:t>1</w:t>
     </w:r>
   </w:p>
 </w:ftr>
@@ -1860,7 +1944,6 @@
   <w:style w:type="character" w:default="1" w:styleId="Domylnaczcionkaakapitu">
     <w:name w:val="Default Paragraph Font"/>
     <w:uiPriority w:val="1"/>
-    <w:semiHidden/>
     <w:unhideWhenUsed/>
   </w:style>
   <w:style w:type="table" w:default="1" w:styleId="Standardowy">

</xml_diff>